<commit_message>
build(dist): rebuild ch1 after scope clarification
https://claude.ai/code/session_01TqgqRfCDLY39798jcQXCr9
</commit_message>
<xml_diff>
--- a/dist/downloads/chuong_1_gioi_thieu.docx
+++ b/dist/downloads/chuong_1_gioi_thieu.docx
@@ -255,7 +255,57 @@
         <w:t xml:space="preserve"> </w:t>
       </w:r>
       <w:r>
-        <w:t xml:space="preserve">có dữ liệu trong Khảo sát Doanh nghiệp của Ngân hàng Thế giới (World Bank Enterprise Surveys, WBES), được phân loại và tổ chức theo 6 sub-regime trong khung ICRV. Sáu sub-regime bao gồm: (i) Advanced Innovation-Driven, đại diện là Singapore, Hàn Quốc và Đài Loan; (ii) Advanced Resource-Driven, đại diện là các nền kinh tế GCC; (iii) Upper-middle, đại diện là Trung Quốc và Malaysia; (iv) Emerging, bao gồm Việt Nam và các nền kinh tế ASEAN đang phát triển; (v) Frontier, bao gồm các nền kinh tế kém phát triển nhất châu Á như Campuchia, Nepal và Afghanistan; và (vi) Pacific SIDS (Small Island Developing States), bao gồm 9 nền kinh tế đảo nhỏ Thái Bình Dương được đưa vào phân tích để kiểm định các điều kiện biên cực đoan của quan hệ I-P. Nhật Bản không nằm trong phạm vi thực nghiệm của luận án do cấu trúc dữ liệu WBES không bao phủ Nhật Bản đầy đủ.</w:t>
+        <w:t xml:space="preserve">có dữ liệu trong Khảo sát Doanh nghiệp của Ngân hàng Thế giới (World Bank Enterprise Surveys, WBES), được phân loại và tổ chức theo 6 sub-regime trong khung ICRV. Sáu sub-regime bao gồm: (i) Advanced Innovation-Driven, đại diện là Singapore, Hàn Quốc và Đài Loan; (ii) Advanced Resource-Driven, đại diện là các nền kinh tế GCC; (iii) Upper-middle, đại diện là Trung Quốc và Malaysia; (iv) Emerging, bao gồm Việt Nam và các nền kinh tế ASEAN đang phát triển; (v) Frontier, bao gồm các nền kinh tế kém phát triển nhất châu Á như Campuchia, Nepal và Afghanistan; và (vi) Pacific SIDS (Small Island Developing States), bao gồm 9 nền kinh tế đảo nhỏ Thái Bình Dương được đưa vào phân tích để kiểm định các điều kiện biên cực đoan của quan hệ I-P. Nhật Bản không nằm trong phạm vi thực nghiệm của luận án do cấu trúc dữ liệu WBES không bao phủ Nhật Bản đầy đủ. Cần lưu ý rằng ký hiệu</w:t>
+      </w:r>
+      <w:r>
+        <w:t xml:space="preserve"> </w:t>
+      </w:r>
+      <w:r>
+        <w:t xml:space="preserve">“</w:t>
+      </w:r>
+      <w:r>
+        <w:t xml:space="preserve">47-49 nền kinh tế</w:t>
+      </w:r>
+      <w:r>
+        <w:t xml:space="preserve">”</w:t>
+      </w:r>
+      <w:r>
+        <w:t xml:space="preserve"> </w:t>
+      </w:r>
+      <w:r>
+        <w:t xml:space="preserve">phản ánh hai phạm vi mẫu khác nhau chứ không phải mâu thuẫn: phân tích mô tả (Chương 4, mục 4.1 và Chuyên đề 1) bao phủ</w:t>
+      </w:r>
+      <w:r>
+        <w:t xml:space="preserve"> </w:t>
+      </w:r>
+      <w:r>
+        <w:rPr>
+          <w:bCs/>
+          <w:b/>
+        </w:rPr>
+        <w:t xml:space="preserve">47 nền kinh tế</w:t>
+      </w:r>
+      <w:r>
+        <w:t xml:space="preserve"> </w:t>
+      </w:r>
+      <w:r>
+        <w:t xml:space="preserve">với 101.185 doanh nghiệp, trong khi mô hình hồi quy đa quốc gia (Nghiên cứu P7, Chương 4) bao phủ</w:t>
+      </w:r>
+      <w:r>
+        <w:t xml:space="preserve"> </w:t>
+      </w:r>
+      <w:r>
+        <w:rPr>
+          <w:bCs/>
+          <w:b/>
+        </w:rPr>
+        <w:t xml:space="preserve">49 nền kinh tế</w:t>
+      </w:r>
+      <w:r>
+        <w:t xml:space="preserve"> </w:t>
+      </w:r>
+      <w:r>
+        <w:t xml:space="preserve">đáp ứng đủ yêu cầu dữ liệu cho ước lượng. Tương tự, nhóm Pacific SIDS được liệt kê gồm các nền kinh tế đảo nhỏ, trong đó số quan sát thực tế đưa vào hồi quy (Nghiên cứu P8) phụ thuộc vào tính sẵn có của dữ liệu sau khi lọc giá trị khuyết.</w:t>
       </w:r>
     </w:p>
     <w:bookmarkEnd w:id="26"/>

</xml_diff>

<commit_message>
build: rebuild DOCX/PDF after skill passes (symbols, em-dash, variable-format)
https://claude.ai/code/session_01TNqoRFY1vAVQL6GWg8X9M3
</commit_message>
<xml_diff>
--- a/dist/downloads/chuong_1_gioi_thieu.docx
+++ b/dist/downloads/chuong_1_gioi_thieu.docx
@@ -40,7 +40,7 @@
         <w:pStyle w:val="FirstParagraph"/>
       </w:pPr>
       <w:r>
-        <w:t xml:space="preserve">Cùng một mức cường độ xuất khẩu có thể nâng một doanh nghiệp ở nền kinh tế thể chế mạnh lên đỉnh năng suất, nhưng lại đẩy một doanh nghiệp ở quốc đảo nhỏ Thái Bình Dương vào vòng suy giảm đơn điệu. Chính nghịch lý đó, cùng một hành vi quốc tế hóa nhưng cho hai kết cục trái ngược tùy chế độ thể chế, là điểm khởi đầu của luận án này. Quốc tế hóa doanh nghiệp đã là một trong những chủ đề trung tâm của kinh doanh quốc tế (international business) suốt hơn nửa thế kỷ qua. Kể từ khi Johanson và Vahlne (1977) đề xuất mô hình Uppsala về quá trình quốc tế hóa tuần tự, gần nửa thế kỷ nghiên cứu đã tích lũy quanh một câu hỏi cốt lõi mà đến nay vẫn chưa có lời đáp dứt khoát: quốc tế hóa có thực sự cải thiện hiệu quả hoạt động của doanh nghiệp hay không, và nếu có thì trong những điều kiện nào? Lu và Beamish (2004) cung cấp bằng chứng then chốt về quan hệ hình chữ S giữa mức độ quốc tế hóa và hiệu quả, còn Contractor et al. (2003) cùng nhiều nghiên cứu kế tiếp tiếp tục thách thức, bổ sung và điều chỉnh kết luận đó. Điều đáng chú ý không phải là sự thiếu vắng bằng chứng. Vấn đề nằm ở sự phân tán của nó. Mối quan hệ giữa quốc tế hóa và hiệu quả hoạt động kinh doanh (internationalization-performance — I-P) là có thực, nhưng phức tạp và phụ thuộc vào nhiều điều kiện biên. Chính tính điều kiện này, chứ không phải bản thân dấu của hiệu ứng, mới là vấn đề lý thuyết cần được giải quyết.</w:t>
+        <w:t xml:space="preserve">Cùng một mức cường độ xuất khẩu có thể nâng một doanh nghiệp ở nền kinh tế thể chế mạnh lên đỉnh năng suất, nhưng lại đẩy một doanh nghiệp ở quốc đảo nhỏ Thái Bình Dương vào vòng suy giảm đơn điệu. Chính nghịch lý đó, cùng một hành vi quốc tế hóa nhưng cho hai kết cục trái ngược tùy chế độ thể chế, là điểm khởi đầu của luận án này. Quốc tế hóa doanh nghiệp đã là một trong những chủ đề trung tâm của kinh doanh quốc tế (international business) suốt hơn nửa thế kỷ qua. Kể từ khi Johanson và Vahlne (1977) đề xuất mô hình Uppsala về quá trình quốc tế hóa tuần tự, gần nửa thế kỷ nghiên cứu đã tích lũy quanh một câu hỏi cốt lõi mà đến nay vẫn chưa có lời đáp dứt khoát: quốc tế hóa có thực sự cải thiện hiệu quả hoạt động của doanh nghiệp hay không, và nếu có thì trong những điều kiện nào? Lu và Beamish (2004) cung cấp bằng chứng then chốt về quan hệ hình chữ S giữa mức độ quốc tế hóa và hiệu quả, còn Contractor et al. (2003) cùng nhiều nghiên cứu kế tiếp tiếp tục thách thức, bổ sung và điều chỉnh kết luận đó. Điều đáng chú ý không phải là sự thiếu vắng bằng chứng. Vấn đề nằm ở sự phân tán của nó. Mối quan hệ giữa quốc tế hóa và hiệu quả hoạt động kinh doanh (internationalization-performance, I-P) là có thực, nhưng phức tạp và phụ thuộc vào nhiều điều kiện biên. Chính tính điều kiện này, chứ không phải bản thân dấu của hiệu ứng, mới là vấn đề lý thuyết cần được giải quyết.</w:t>
       </w:r>
     </w:p>
     <w:p>
@@ -97,7 +97,7 @@
         <w:pStyle w:val="BodyText"/>
       </w:pPr>
       <w:r>
-        <w:t xml:space="preserve">Thể chế là tầng giải thích không thể bỏ qua khi bàn về kết quả quốc tế hóa. Lý thuyết thể chế (institutional theory) của North (1990) cùng Khanna và Palepu (2010) khẳng định rằng thể chế tạo ra cấu trúc khuyến khích và chi phí giao dịch khác nhau giữa các quốc gia. Ở các thị trường mới nổi, khoảng trống thể chế (institutional voids), tức sự thiếu hụt các thể chế trung gian hỗ trợ giao dịch thị trường, đẩy chi phí quốc tế hóa của doanh nghiệp lên đáng kể (Khanna &amp; Palepu, 2010; Peng, 2003). Sự đa dạng thể chế giữa các quốc gia châu Á trải dài từ những nền kinh tế quản trị ổn định và pháp quyền mạnh như Singapore đến các nền kinh tế đang trong quá trình phát triển thể chế như Campuchia hay các quốc đảo Thái Bình Dương. Dải biến thiên đó đặc biệt phong phú và rất thuận lợi cho việc kiểm định. Luận án tiếp cận dải biến thiên ấy một cách hệ thống thông qua khung phân loại thể chế sáu nhóm được phát triển riêng cho luận án, gọi là Biến thiên chế độ bối cảnh thể chế (Institutional Context Regime Variation — ICRV). Khác với cách hiểu thể chế như một bối cảnh tĩnh, luận án định vị ICRV như một bộ lọc chi phí giao dịch (transaction cost filter): ở chế độ thể chế mạnh, bộ lọc cho giao dịch xuất khẩu đi qua trơn tru nên doanh nghiệp duy trì được lợi ích đến mức cường độ cao; ở chế độ thể chế yếu, bộ lọc tắc nghẽn, biến xuất khẩu thành một gánh nặng trừ khi doanh nghiệp sở hữu những tấm lá chắn số và công nghệ nội tại bù đắp cho khoảng trống thể chế.</w:t>
+        <w:t xml:space="preserve">Thể chế là tầng giải thích không thể bỏ qua khi bàn về kết quả quốc tế hóa. Lý thuyết thể chế (institutional theory) của North (1990) cùng Khanna và Palepu (2010) khẳng định rằng thể chế tạo ra cấu trúc khuyến khích và chi phí giao dịch khác nhau giữa các quốc gia. Ở các thị trường mới nổi, khoảng trống thể chế (institutional voids), tức sự thiếu hụt các thể chế trung gian hỗ trợ giao dịch thị trường, đẩy chi phí quốc tế hóa của doanh nghiệp lên đáng kể (Khanna &amp; Palepu, 2010; Peng, 2003). Sự đa dạng thể chế giữa các quốc gia châu Á trải dài từ những nền kinh tế quản trị ổn định và pháp quyền mạnh như Singapore đến các nền kinh tế đang trong quá trình phát triển thể chế như Campuchia hay các quốc đảo Thái Bình Dương. Dải biến thiên đó đặc biệt phong phú và rất thuận lợi cho việc kiểm định. Luận án tiếp cận dải biến thiên ấy một cách hệ thống thông qua khung phân loại thể chế sáu nhóm được phát triển riêng cho luận án, gọi là Biến thiên chế độ bối cảnh thể chế (Institutional Context Regime Variation, ICRV). Khác với cách hiểu thể chế như một bối cảnh tĩnh, luận án định vị ICRV như một bộ lọc chi phí giao dịch (transaction cost filter): ở chế độ thể chế mạnh, bộ lọc cho giao dịch xuất khẩu đi qua trơn tru nên doanh nghiệp duy trì được lợi ích đến mức cường độ cao; ở chế độ thể chế yếu, bộ lọc tắc nghẽn, biến xuất khẩu thành một gánh nặng trừ khi doanh nghiệp sở hữu những tấm lá chắn số và công nghệ nội tại bù đắp cho khoảng trống thể chế.</w:t>
       </w:r>
     </w:p>
     <w:p>
@@ -172,7 +172,7 @@
         <w:pStyle w:val="BodyText"/>
       </w:pPr>
       <w:r>
-        <w:t xml:space="preserve">Từ mục tiêu chung đó, luận án triển khai bốn mục tiêu cụ thể. Mục tiêu thứ nhất là tổng hợp và cập nhật bằng chứng phân tích tổng hợp về quan hệ I-P trong giai đoạn 1982-2026, qua đó xác định tác động tổng hợp, mức độ dị biệt, và những biến điều tiết chính giải thích sự dị biệt giữa các nghiên cứu. Mục tiêu thứ hai là kiểm định cơ chế cụ thể của quan hệ I-P trong các bối cảnh quốc gia khác nhau, gồm Singapore với tư cách nền kinh tế nhỏ mở tiên tiến, Việt Nam với tư cách nền kinh tế chuyển đổi đang mở rộng, và Trung Quốc với tư cách nền kinh tế thu nhập trung bình cao quy mô lớn; so sánh ba bối cảnh này giúp làm rõ cách các cơ chế I-P vận hành khác nhau theo từng quốc gia, đồng thời kiểm định tính ổn định của cấu trúc phi tuyến theo thời gian. Mục tiêu thứ ba là mở rộng phân tích sang phạm vi đa quốc gia gồm 45 nền kinh tế châu Á và Thái Bình Dương, trong đó có nhóm các quốc đảo nhỏ Thái Bình Dương, nhằm kiểm định khả năng khái quát hóa của các phát hiện trên một dải bối cảnh thể chế rộng, kế thừa và mở rộng từ tập 17 nền kinh tế trong Do và Phan (2026a). Mục tiêu thứ tư là phân tích vai trò điều tiết của ba nhóm nhân tố: thể chế (đo bằng các nhóm con ICRV cùng các chỉ số rào cản thể chế), năng lực số (phân biệt rõ Chỉ số năng lực công nghệ — Technological Capability Index — TCI với Chỉ số chấp nhận số — Digital Adoption Index — DAI), và đặc điểm nhà quản trị cấp cao (kinh nghiệm và giới tính).</w:t>
+        <w:t xml:space="preserve">Từ mục tiêu chung đó, luận án triển khai bốn mục tiêu cụ thể. Mục tiêu thứ nhất là tổng hợp và cập nhật bằng chứng phân tích tổng hợp về quan hệ I-P trong giai đoạn 1982-2026, qua đó xác định tác động tổng hợp, mức độ dị biệt, và những biến điều tiết chính giải thích sự dị biệt giữa các nghiên cứu. Mục tiêu thứ hai là kiểm định cơ chế cụ thể của quan hệ I-P trong các bối cảnh quốc gia khác nhau, gồm Singapore với tư cách nền kinh tế nhỏ mở tiên tiến, Việt Nam với tư cách nền kinh tế chuyển đổi đang mở rộng, và Trung Quốc với tư cách nền kinh tế thu nhập trung bình cao quy mô lớn; so sánh ba bối cảnh này giúp làm rõ cách các cơ chế I-P vận hành khác nhau theo từng quốc gia, đồng thời kiểm định tính ổn định của cấu trúc phi tuyến theo thời gian. Mục tiêu thứ ba là mở rộng phân tích sang phạm vi đa quốc gia gồm 45 nền kinh tế châu Á và Thái Bình Dương, trong đó có nhóm các quốc đảo nhỏ Thái Bình Dương, nhằm kiểm định khả năng khái quát hóa của các phát hiện trên một dải bối cảnh thể chế rộng, kế thừa và mở rộng từ tập 17 nền kinh tế trong Do và Phan (2026a). Mục tiêu thứ tư là phân tích vai trò điều tiết của ba nhóm nhân tố: thể chế (đo bằng các nhóm con ICRV cùng các chỉ số rào cản thể chế), năng lực số (phân biệt rõ Chỉ số năng lực công nghệ, Technological Capability Index, TCI với Chỉ số chấp nhận số, Digital Adoption Index, DAI), và đặc điểm nhà quản trị cấp cao (kinh nghiệm và giới tính).</w:t>
       </w:r>
     </w:p>
     <w:p>
@@ -271,7 +271,7 @@
         <w:pStyle w:val="FirstParagraph"/>
       </w:pPr>
       <w:r>
-        <w:t xml:space="preserve">Đối tượng nghiên cứu của luận án là mối quan hệ giữa quốc tế hóa và hiệu quả hoạt động kinh doanh của doanh nghiệp, cùng với các nhân tố điều tiết mối quan hệ đó, gồm bối cảnh thể chế, năng lực số và đặc điểm nhà quản trị cấp cao. Đơn vị phân tích là doanh nghiệp ở cấp độ tổ chức, không phải cấp độ ngành hay cấp độ quốc gia. Trong luận án, quốc tế hóa được đo chủ yếu bằng tỷ lệ doanh thu xuất khẩu trên tổng doanh thu (Foreign Sales to Total Sales — FSTS), tức cường độ xuất khẩu, còn hiệu quả hoạt động được đo chủ yếu bằng năng suất lao động, bổ sung bằng tỷ suất lợi nhuận trên doanh thu và tăng trưởng doanh thu trong các kiểm tra độ vững.</w:t>
+        <w:t xml:space="preserve">Đối tượng nghiên cứu của luận án là mối quan hệ giữa quốc tế hóa và hiệu quả hoạt động kinh doanh của doanh nghiệp, cùng với các nhân tố điều tiết mối quan hệ đó, gồm bối cảnh thể chế, năng lực số và đặc điểm nhà quản trị cấp cao. Đơn vị phân tích là doanh nghiệp ở cấp độ tổ chức, không phải cấp độ ngành hay cấp độ quốc gia. Trong luận án, quốc tế hóa được đo chủ yếu bằng tỷ lệ doanh thu xuất khẩu trên tổng doanh thu (Foreign Sales to Total Sales, FSTS), tức cường độ xuất khẩu, còn hiệu quả hoạt động được đo chủ yếu bằng năng suất lao động, bổ sung bằng tỷ suất lợi nhuận trên doanh thu và tăng trưởng doanh thu trong các kiểm tra độ vững.</w:t>
       </w:r>
     </w:p>
     <w:bookmarkEnd w:id="23"/>
@@ -289,7 +289,7 @@
         <w:pStyle w:val="FirstParagraph"/>
       </w:pPr>
       <w:r>
-        <w:t xml:space="preserve">Phạm vi không gian chính của nghiên cứu gồm 45 nền kinh tế châu Á và Thái Bình Dương có dữ liệu trong Khảo sát Doanh nghiệp của Ngân hàng Thế giới (World Bank Enterprise Surveys — WBES), được phân loại và tổ chức theo sáu nhóm con trong khung ICRV. Sáu nhóm con đó là: nhóm tiên tiến dẫn dắt bằng đổi mới (Advanced Innovation-Driven), đại diện là Singapore, Hàn Quốc và Đài Loan; nhóm tiên tiến dẫn dắt bằng tài nguyên (Advanced Resource-Driven), đại diện là các nền kinh tế vùng Vịnh; nhóm thu nhập trung bình cao (Upper-middle), đại diện là Trung Quốc và Malaysia; nhóm đang nổi (Emerging), gồm Việt Nam và các nền kinh tế ASEAN đang phát triển; nhóm cận biên (Frontier), gồm các nền kinh tế kém phát triển nhất như Campuchia, Nepal và Bangladesh; và nhóm quốc đảo nhỏ Thái Bình Dương (Pacific SIDS), gồm các quốc đảo nhỏ đang phát triển (Small Island Developing States — SIDS) được đưa vào phân tích để kiểm định các điều kiện biên cực đoan của quan hệ I-P. Nhật Bản không nằm trong phạm vi thực nghiệm vì cấu trúc dữ liệu WBES không bao phủ Nhật Bản đầy đủ.</w:t>
+        <w:t xml:space="preserve">Phạm vi không gian chính của nghiên cứu gồm 45 nền kinh tế châu Á và Thái Bình Dương có dữ liệu trong Khảo sát Doanh nghiệp của Ngân hàng Thế giới (World Bank Enterprise Surveys, WBES), được phân loại và tổ chức theo sáu nhóm con trong khung ICRV. Sáu nhóm con đó là: nhóm tiên tiến dẫn dắt bằng đổi mới (Advanced Innovation-Driven), đại diện là Singapore, Hàn Quốc và Đài Loan; nhóm tiên tiến dẫn dắt bằng tài nguyên (Advanced Resource-Driven), đại diện là các nền kinh tế vùng Vịnh; nhóm thu nhập trung bình cao (Upper-middle), đại diện là Trung Quốc và Malaysia; nhóm đang nổi (Emerging), gồm Việt Nam và các nền kinh tế ASEAN đang phát triển; nhóm cận biên (Frontier), gồm các nền kinh tế kém phát triển nhất như Campuchia, Nepal và Bangladesh; và nhóm quốc đảo nhỏ Thái Bình Dương (Pacific SIDS), gồm các quốc đảo nhỏ đang phát triển (Small Island Developing States, SIDS) được đưa vào phân tích để kiểm định các điều kiện biên cực đoan của quan hệ I-P. Nhật Bản không nằm trong phạm vi thực nghiệm vì cấu trúc dữ liệu WBES không bao phủ Nhật Bản đầy đủ.</w:t>
       </w:r>
     </w:p>
     <w:p>
@@ -417,7 +417,7 @@
         <w:pStyle w:val="FirstParagraph"/>
       </w:pPr>
       <w:r>
-        <w:t xml:space="preserve">Về mặt lý thuyết, luận án đóng góp vào tài liệu nghiên cứu kinh doanh quốc tế theo bốn hướng gắn bó với nhau. Đóng góp thứ nhất là tích hợp bốn lý thuyết kinh điển, gồm mô hình Uppsala, quan điểm dựa trên nguồn lực (resource-based view — RBV), lý thuyết thể chế và lý thuyết Bậc trên, vào một khung giải thích đa tầng thống nhất, được bổ sung bằng một lớp mở rộng về năng lực số để phản ánh chuyển đổi số đương đại. Khung này không phải là sự ghép nối cơ học các lý thuyết, mà là một kiến trúc lý thuyết nhất quán nội tại, trong đó mỗi tầng giải thích một dạng dị biệt khác nhau của quan hệ I-P. Đóng góp thứ hai là tách bạch rõ ràng năng lực công nghệ với chấp nhận số, coi đây là hai cấu trúc khái niệm độc lập dựa trên những nền tảng lý thuyết khác nhau (Bharadwaj et al., 2013; Coltman et al., 2008; Verhoef et al., 2021). Sự tách bạch này lấp một thiếu hụt khái niệm quan trọng trong các nghiên cứu về số hóa và quốc tế hóa, vốn thường gộp chung hai cấu trúc khác nhau về bản chất. Đóng góp thứ ba là tái định vị mô hình Uppsala trong kỷ nguyên trí tuệ nhân tạo, bằng cách mở rộng cơ chế học hỏi để bao hàm cả học hỏi tăng cường bằng dữ liệu số, phù hợp với xu hướng quốc tế hóa được hỗ trợ bằng công nghệ số (Banalieva &amp; Dhanaraj, 2019; Yang et al., 2025).</w:t>
+        <w:t xml:space="preserve">Về mặt lý thuyết, luận án đóng góp vào tài liệu nghiên cứu kinh doanh quốc tế theo bốn hướng gắn bó với nhau. Đóng góp thứ nhất là tích hợp bốn lý thuyết kinh điển, gồm mô hình Uppsala, quan điểm dựa trên nguồn lực (resource-based view, RBV), lý thuyết thể chế và lý thuyết Bậc trên, vào một khung giải thích đa tầng thống nhất, được bổ sung bằng một lớp mở rộng về năng lực số để phản ánh chuyển đổi số đương đại. Khung này không phải là sự ghép nối cơ học các lý thuyết, mà là một kiến trúc lý thuyết nhất quán nội tại, trong đó mỗi tầng giải thích một dạng dị biệt khác nhau của quan hệ I-P. Đóng góp thứ hai là tách bạch rõ ràng năng lực công nghệ với chấp nhận số, coi đây là hai cấu trúc khái niệm độc lập dựa trên những nền tảng lý thuyết khác nhau (Bharadwaj et al., 2013; Coltman et al., 2008; Verhoef et al., 2021). Sự tách bạch này lấp một thiếu hụt khái niệm quan trọng trong các nghiên cứu về số hóa và quốc tế hóa, vốn thường gộp chung hai cấu trúc khác nhau về bản chất. Đóng góp thứ ba là tái định vị mô hình Uppsala trong kỷ nguyên trí tuệ nhân tạo, bằng cách mở rộng cơ chế học hỏi để bao hàm cả học hỏi tăng cường bằng dữ liệu số, phù hợp với xu hướng quốc tế hóa được hỗ trợ bằng công nghệ số (Banalieva &amp; Dhanaraj, 2019; Yang et al., 2025).</w:t>
       </w:r>
     </w:p>
     <w:p>

</xml_diff>